<commit_message>
Comments added for all classes
</commit_message>
<xml_diff>
--- a/WeatherApp_Doc.docx
+++ b/WeatherApp_Doc.docx
@@ -246,6 +246,13 @@
         </w:rPr>
         <w:t xml:space="preserve"> by entering name of the city we will get the following weather details</w:t>
       </w:r>
+      <w:r>
+        <w:rPr>
+          <w:sz w:val="28"/>
+          <w:szCs w:val="28"/>
+        </w:rPr>
+        <w:t>.</w:t>
+      </w:r>
     </w:p>
     <w:p>
       <w:pPr>
@@ -457,7 +464,35 @@
           <w:sz w:val="28"/>
           <w:szCs w:val="28"/>
         </w:rPr>
-        <w:t>Handled errors appropriately, added network status observers to get the network status (online/offline) based on status handled the app data.</w:t>
+        <w:t xml:space="preserve">Handled errors appropriately, added network status observers to get the network status (online/offline) based on </w:t>
+      </w:r>
+      <w:r>
+        <w:rPr>
+          <w:sz w:val="28"/>
+          <w:szCs w:val="28"/>
+        </w:rPr>
+        <w:t xml:space="preserve">the </w:t>
+      </w:r>
+      <w:r>
+        <w:rPr>
+          <w:sz w:val="28"/>
+          <w:szCs w:val="28"/>
+        </w:rPr>
+        <w:t>status</w:t>
+      </w:r>
+      <w:r>
+        <w:rPr>
+          <w:sz w:val="28"/>
+          <w:szCs w:val="28"/>
+        </w:rPr>
+        <w:t>,</w:t>
+      </w:r>
+      <w:r>
+        <w:rPr>
+          <w:sz w:val="28"/>
+          <w:szCs w:val="28"/>
+        </w:rPr>
+        <w:t xml:space="preserve"> handled the app data.</w:t>
       </w:r>
     </w:p>
     <w:p>
@@ -484,7 +519,21 @@
           <w:sz w:val="28"/>
           <w:szCs w:val="28"/>
         </w:rPr>
-        <w:t>, recently added city displaying on top of the list (Index 0).</w:t>
+        <w:t>, recently added city</w:t>
+      </w:r>
+      <w:r>
+        <w:rPr>
+          <w:sz w:val="28"/>
+          <w:szCs w:val="28"/>
+        </w:rPr>
+        <w:t xml:space="preserve"> is</w:t>
+      </w:r>
+      <w:r>
+        <w:rPr>
+          <w:sz w:val="28"/>
+          <w:szCs w:val="28"/>
+        </w:rPr>
+        <w:t xml:space="preserve"> displaying on top of the list (Index 0).</w:t>
       </w:r>
     </w:p>
     <w:p>
@@ -602,7 +651,6 @@
           <w:sz w:val="32"/>
           <w:szCs w:val="32"/>
         </w:rPr>
-        <w:lastRenderedPageBreak/>
         <w:t>App Flow follows:</w:t>
       </w:r>
     </w:p>
@@ -914,7 +962,6 @@
           <w:sz w:val="32"/>
           <w:szCs w:val="32"/>
         </w:rPr>
-        <w:lastRenderedPageBreak/>
         <w:t xml:space="preserve">Approach </w:t>
       </w:r>
       <w:r>
@@ -961,12 +1008,14 @@
     <w:p>
       <w:pPr>
         <w:rPr>
-          <w:sz w:val="28"/>
-          <w:szCs w:val="28"/>
-        </w:rPr>
-      </w:pPr>
-      <w:r>
-        <w:rPr>
+          <w:b/>
+          <w:sz w:val="28"/>
+          <w:szCs w:val="28"/>
+        </w:rPr>
+      </w:pPr>
+      <w:r>
+        <w:rPr>
+          <w:b/>
           <w:sz w:val="28"/>
           <w:szCs w:val="28"/>
         </w:rPr>
@@ -1115,30 +1164,72 @@
           <w:sz w:val="28"/>
           <w:szCs w:val="28"/>
         </w:rPr>
-        <w:t>This API will fetch the single city weather details, If we have N number of cities we can’t use this API by call each city and adding the result data in a array / list.</w:t>
-      </w:r>
-    </w:p>
-    <w:p>
-      <w:pPr>
-        <w:rPr>
-          <w:sz w:val="28"/>
-          <w:szCs w:val="28"/>
-        </w:rPr>
-      </w:pPr>
-    </w:p>
-    <w:p>
-      <w:pPr>
-        <w:rPr>
-          <w:sz w:val="28"/>
-          <w:szCs w:val="28"/>
-        </w:rPr>
-      </w:pPr>
-      <w:r>
-        <w:rPr>
-          <w:sz w:val="28"/>
-          <w:szCs w:val="28"/>
-        </w:rPr>
-        <w:t>In our case we need to get more than one city details, by default London and Paris city details we are fetching. In addition to that we have add functionality so we can’t use the above API.</w:t>
+        <w:t>This API will fetch the single city weather details, If we have N number of cities we can’t use this API by call</w:t>
+      </w:r>
+      <w:r>
+        <w:rPr>
+          <w:sz w:val="28"/>
+          <w:szCs w:val="28"/>
+        </w:rPr>
+        <w:t>ing</w:t>
+      </w:r>
+      <w:r>
+        <w:rPr>
+          <w:sz w:val="28"/>
+          <w:szCs w:val="28"/>
+        </w:rPr>
+        <w:t xml:space="preserve"> each city and adding the result data in a</w:t>
+      </w:r>
+      <w:r>
+        <w:rPr>
+          <w:sz w:val="28"/>
+          <w:szCs w:val="28"/>
+        </w:rPr>
+        <w:t>n</w:t>
+      </w:r>
+      <w:r>
+        <w:rPr>
+          <w:sz w:val="28"/>
+          <w:szCs w:val="28"/>
+        </w:rPr>
+        <w:t xml:space="preserve"> array / list.</w:t>
+      </w:r>
+    </w:p>
+    <w:p>
+      <w:pPr>
+        <w:rPr>
+          <w:sz w:val="28"/>
+          <w:szCs w:val="28"/>
+        </w:rPr>
+      </w:pPr>
+    </w:p>
+    <w:p>
+      <w:pPr>
+        <w:rPr>
+          <w:sz w:val="28"/>
+          <w:szCs w:val="28"/>
+        </w:rPr>
+      </w:pPr>
+      <w:r>
+        <w:rPr>
+          <w:sz w:val="28"/>
+          <w:szCs w:val="28"/>
+        </w:rPr>
+        <w:t>In our case we need to get more than one city details, by default London and Paris city details</w:t>
+      </w:r>
+      <w:r>
+        <w:rPr>
+          <w:sz w:val="28"/>
+          <w:szCs w:val="28"/>
+        </w:rPr>
+        <w:t>,</w:t>
+      </w:r>
+      <w:r>
+        <w:rPr>
+          <w:sz w:val="28"/>
+          <w:szCs w:val="28"/>
+        </w:rPr>
+        <w:t xml:space="preserve"> we are fetching. In addition to that we have add functionality so we can’t use the above API.</w:t>
       </w:r>
     </w:p>
     <w:p>
@@ -1175,12 +1266,14 @@
     <w:p>
       <w:pPr>
         <w:rPr>
-          <w:sz w:val="28"/>
-          <w:szCs w:val="28"/>
-        </w:rPr>
-      </w:pPr>
-      <w:r>
-        <w:rPr>
+          <w:b/>
+          <w:sz w:val="28"/>
+          <w:szCs w:val="28"/>
+        </w:rPr>
+      </w:pPr>
+      <w:r>
+        <w:rPr>
+          <w:b/>
           <w:sz w:val="28"/>
           <w:szCs w:val="28"/>
         </w:rPr>
@@ -1207,7 +1300,35 @@
           <w:sz w:val="28"/>
           <w:szCs w:val="28"/>
         </w:rPr>
-        <w:t xml:space="preserve">Open weather API providing more than 200,000 locations to fetch the weather data. We can’t get the city Ids at runtime, so I used </w:t>
+        <w:t>Open weather API providing more than 200,000 locations to fetch the weather data</w:t>
+      </w:r>
+      <w:r>
+        <w:rPr>
+          <w:sz w:val="28"/>
+          <w:szCs w:val="28"/>
+        </w:rPr>
+        <w:t>.</w:t>
+      </w:r>
+      <w:r>
+        <w:rPr>
+          <w:sz w:val="28"/>
+          <w:szCs w:val="28"/>
+        </w:rPr>
+        <w:t xml:space="preserve"> </w:t>
+      </w:r>
+      <w:r>
+        <w:rPr>
+          <w:sz w:val="28"/>
+          <w:szCs w:val="28"/>
+        </w:rPr>
+        <w:t>S</w:t>
+      </w:r>
+      <w:r>
+        <w:rPr>
+          <w:sz w:val="28"/>
+          <w:szCs w:val="28"/>
+        </w:rPr>
+        <w:t xml:space="preserve">o I used </w:t>
       </w:r>
       <w:proofErr w:type="spellStart"/>
       <w:r>
@@ -1240,7 +1361,14 @@
           <w:sz w:val="28"/>
           <w:szCs w:val="28"/>
         </w:rPr>
-        <w:t xml:space="preserve"> file provided by the Open Weather Maps.</w:t>
+        <w:t xml:space="preserve"> file provided by the Open Weather Maps</w:t>
+      </w:r>
+      <w:r>
+        <w:rPr>
+          <w:sz w:val="28"/>
+          <w:szCs w:val="28"/>
+        </w:rPr>
+        <w:t>, to get the city ID.</w:t>
       </w:r>
     </w:p>
     <w:p>
@@ -1391,7 +1519,21 @@
           <w:sz w:val="28"/>
           <w:szCs w:val="28"/>
         </w:rPr>
-        <w:t>This way we are getting the list of cities weather details and updating the details to list.</w:t>
+        <w:t xml:space="preserve">This way we are getting the list of cities weather details and updating the details to </w:t>
+      </w:r>
+      <w:r>
+        <w:rPr>
+          <w:sz w:val="28"/>
+          <w:szCs w:val="28"/>
+        </w:rPr>
+        <w:t xml:space="preserve"> the </w:t>
+      </w:r>
+      <w:r>
+        <w:rPr>
+          <w:sz w:val="28"/>
+          <w:szCs w:val="28"/>
+        </w:rPr>
+        <w:t>list.</w:t>
       </w:r>
     </w:p>
     <w:p>
@@ -1456,7 +1598,6 @@
           <w:sz w:val="32"/>
           <w:szCs w:val="32"/>
         </w:rPr>
-        <w:lastRenderedPageBreak/>
         <w:t>Assumption</w:t>
       </w:r>
       <w:r>
@@ -1757,7 +1898,21 @@
           <w:sz w:val="28"/>
           <w:szCs w:val="28"/>
         </w:rPr>
-        <w:t xml:space="preserve">but it will </w:t>
+        <w:t xml:space="preserve">but </w:t>
+      </w:r>
+      <w:r>
+        <w:rPr>
+          <w:sz w:val="28"/>
+          <w:szCs w:val="28"/>
+        </w:rPr>
+        <w:t>we</w:t>
+      </w:r>
+      <w:r>
+        <w:rPr>
+          <w:sz w:val="28"/>
+          <w:szCs w:val="28"/>
+        </w:rPr>
+        <w:t xml:space="preserve"> will </w:t>
       </w:r>
       <w:r>
         <w:rPr>
@@ -1932,7 +2087,6 @@
           <w:sz w:val="28"/>
           <w:szCs w:val="28"/>
         </w:rPr>
-        <w:lastRenderedPageBreak/>
         <w:t>Settings functionality</w:t>
       </w:r>
       <w:r>
@@ -2201,6 +2355,7 @@
     <w:p>
       <w:pPr>
         <w:rPr>
+          <w:b/>
           <w:sz w:val="28"/>
           <w:szCs w:val="28"/>
         </w:rPr>
@@ -2209,6 +2364,7 @@
       <w:bookmarkStart w:id="1" w:name="OLE_LINK2"/>
       <w:r>
         <w:rPr>
+          <w:b/>
           <w:sz w:val="28"/>
           <w:szCs w:val="28"/>
         </w:rPr>
@@ -2216,6 +2372,7 @@
       </w:r>
       <w:r>
         <w:rPr>
+          <w:b/>
           <w:sz w:val="28"/>
           <w:szCs w:val="28"/>
         </w:rPr>
@@ -2225,6 +2382,7 @@
       <w:bookmarkEnd w:id="1"/>
       <w:r>
         <w:rPr>
+          <w:b/>
           <w:sz w:val="28"/>
           <w:szCs w:val="28"/>
         </w:rPr>
@@ -2364,6 +2522,7 @@
     <w:p>
       <w:pPr>
         <w:rPr>
+          <w:b/>
           <w:sz w:val="28"/>
           <w:szCs w:val="28"/>
         </w:rPr>
@@ -2373,6 +2532,7 @@
       <w:bookmarkStart w:id="4" w:name="OLE_LINK5"/>
       <w:r>
         <w:rPr>
+          <w:b/>
           <w:sz w:val="28"/>
           <w:szCs w:val="28"/>
         </w:rPr>
@@ -2381,6 +2541,7 @@
       <w:bookmarkEnd w:id="2"/>
       <w:r>
         <w:rPr>
+          <w:b/>
           <w:sz w:val="28"/>
           <w:szCs w:val="28"/>
         </w:rPr>
@@ -2390,6 +2551,7 @@
       <w:bookmarkEnd w:id="4"/>
       <w:r>
         <w:rPr>
+          <w:b/>
           <w:sz w:val="28"/>
           <w:szCs w:val="28"/>
         </w:rPr>
@@ -2471,7 +2633,15 @@
           <w:sz w:val="28"/>
           <w:szCs w:val="28"/>
         </w:rPr>
-        <w:t xml:space="preserve">s / feature to the existing code, sometimes we need to change old design and code. However, changing the already existing code is both risky and costly. If we have unit testing in place, then we can proceed for </w:t>
+        <w:t xml:space="preserve">s / feature to the existing code, sometimes we need to change old design and code. However, changing the already existing code is both risky and costly. If </w:t>
+      </w:r>
+      <w:r>
+        <w:rPr>
+          <w:sz w:val="28"/>
+          <w:szCs w:val="28"/>
+        </w:rPr>
+        <w:lastRenderedPageBreak/>
+        <w:t xml:space="preserve">we have unit testing in place, then we can proceed for </w:t>
       </w:r>
       <w:r>
         <w:rPr>
@@ -2507,7 +2677,6 @@
           <w:sz w:val="28"/>
           <w:szCs w:val="28"/>
         </w:rPr>
-        <w:lastRenderedPageBreak/>
         <w:t>To catch bugs earlier</w:t>
       </w:r>
       <w:r>
@@ -2556,7 +2725,14 @@
           <w:sz w:val="28"/>
           <w:szCs w:val="28"/>
         </w:rPr>
-        <w:t>Makes code debugging easy</w:t>
+        <w:t>Makes code debugging eas</w:t>
+      </w:r>
+      <w:r>
+        <w:rPr>
+          <w:sz w:val="28"/>
+          <w:szCs w:val="28"/>
+        </w:rPr>
+        <w:t>ier</w:t>
       </w:r>
     </w:p>
     <w:p>
@@ -2576,27 +2752,42 @@
           <w:sz w:val="28"/>
           <w:szCs w:val="28"/>
         </w:rPr>
-        <w:t>Unit tests reduces the defects in the newly developed features/ feature.</w:t>
-      </w:r>
+        <w:t xml:space="preserve">Unit tests </w:t>
+      </w:r>
+      <w:r>
+        <w:rPr>
+          <w:b/>
+          <w:sz w:val="28"/>
+          <w:szCs w:val="28"/>
+        </w:rPr>
+        <w:t>reduces the defects in the newly developed features/ feature</w:t>
+      </w:r>
+      <w:r>
+        <w:rPr>
+          <w:sz w:val="28"/>
+          <w:szCs w:val="28"/>
+        </w:rPr>
+        <w:t>.</w:t>
+      </w:r>
+    </w:p>
+    <w:p>
+      <w:pPr>
+        <w:pStyle w:val="ListParagraph"/>
+        <w:rPr>
+          <w:sz w:val="28"/>
+          <w:szCs w:val="28"/>
+        </w:rPr>
+      </w:pPr>
+    </w:p>
+    <w:p>
+      <w:pPr>
+        <w:rPr>
+          <w:sz w:val="28"/>
+          <w:szCs w:val="28"/>
+        </w:rPr>
+      </w:pPr>
       <w:bookmarkStart w:id="5" w:name="_GoBack"/>
       <w:bookmarkEnd w:id="5"/>
-    </w:p>
-    <w:p>
-      <w:pPr>
-        <w:pStyle w:val="ListParagraph"/>
-        <w:rPr>
-          <w:sz w:val="28"/>
-          <w:szCs w:val="28"/>
-        </w:rPr>
-      </w:pPr>
-    </w:p>
-    <w:p>
-      <w:pPr>
-        <w:rPr>
-          <w:sz w:val="28"/>
-          <w:szCs w:val="28"/>
-        </w:rPr>
-      </w:pPr>
     </w:p>
     <w:sectPr>
       <w:pgSz w:w="11900" w:h="16840"/>

</xml_diff>